<commit_message>
Correct John Hart reply: Refuge financials will show minimal revenue
The prior draft overstated Refuge Hospice's operating history as
support for change-of-ownership classification. Corrected: Refuge is
license-only with near-zero historical revenue despite 3 years of CMS
certification. Repayment case rests on projections, not target
historicals - closer to startup underwriting for that purpose even
though CMS treats the 49/51 transfer as a change of ownership. Package
audit re-verified 40/40.

Co-Authored-By: Claude Fable 5 <noreply@anthropic.com>
Claude-Session: https://claude.ai/code/session_01GAHLyfqLR9bxwN2jm6VjPU
</commit_message>
<xml_diff>
--- a/sba_application/13_checklist_response_2026-07-16/11 Reply to John Hart - Follow-up Questions DRAFT.docx
+++ b/sba_application/13_checklist_response_2026-07-16/11 Reply to John Hart - Follow-up Questions DRAFT.docx
@@ -44,7 +44,7 @@
           <w:b w:val="0"/>
           <w:sz w:val="22"/>
         </w:rPr>
-        <w:t>On your first question: this should be underwritten as a change of ownership, not a pure startup. The borrower, Tyler Hospice Hold, LLC, is new, but the asset we're buying, Refuge Hospice, LLC, has been operating and billing Medicare since its CMS certification on 1/8/2024, so there's real operating history at the target level, just not at the buyer level. That's the framing in the business plan addendum too. Our equity injection is $250,000 on a $750,000 project, 33 percent, so we're well above the minimum either way this gets classified - that shouldn't be a swing factor.</w:t>
+        <w:t>On your first question, I want to be straight with you rather than let you find this out later: Refuge Hospice, LLC has been CMS certified since 1/8/2024, so it technically has three years of entity financials, but it's been run as a license-only operation, not an active clinical program. The tax returns and financials will show close to zero - there's no meaningful patient revenue to point to for repayment history. So while the CMS side of this is a change of ownership (the 49/51 transfer under the 36-month rule), from a repayment-ability standpoint I think it has to be underwritten like a startup: the case rests on our projections and the team's own prior track record in this market, not on Refuge's historical numbers. Our equity injection is $250,000 on a $750,000 project, 33 percent, well above the startup threshold, so that side of it is covered. Let me know how you and your lenders want to treat it once you've seen the financials - happy to adjust the file either way.</w:t>
       </w:r>
     </w:p>
     <w:p>
@@ -53,7 +53,7 @@
           <w:b w:val="0"/>
           <w:sz w:val="22"/>
         </w:rPr>
-        <w:t>On the second question: yes, we're already after the sellers for Refuge's three years of tax returns and current financials, since the license has been certified and billing since January 2024. I'll push on that this week and get it to you and Mary as soon as it lands. I also understand a third party valuation will be required on an acquisition like this - I'll hold off ordering one until we know which lender is running with it, since I know each bank has its own approved list.</w:t>
+        <w:t>On the second question: yes, we'll get you what exists - three years of returns and financials for Refuge - but I want to set expectations now that they won't show much, for the reason above. I also understand a third party valuation will be required on an acquisition like this - I'll hold off ordering one until we know which lender is running with it, since I know each bank has its own approved list.</w:t>
       </w:r>
     </w:p>
     <w:p>

</xml_diff>